<commit_message>
feat: Update calendar date to March 11, 2026 and add note on holiday adjustments
</commit_message>
<xml_diff>
--- a/CF PLANTILLA CALENDARIO 2025.docx
+++ b/CF PLANTILLA CALENDARIO 2025.docx
@@ -46,7 +46,7 @@
         <w:rPr>
           <w:rFonts w:cs="Arial"/>
         </w:rPr>
-        <w:t>01</w:t>
+        <w:t>11</w:t>
       </w:r>
       <w:r>
         <w:rPr>
@@ -58,7 +58,7 @@
         <w:rPr>
           <w:rFonts w:cs="Arial"/>
         </w:rPr>
-        <w:t>agosto</w:t>
+        <w:t>marzo</w:t>
       </w:r>
       <w:r>
         <w:rPr>
@@ -82,15 +82,7 @@
           <w:sz w:val="18"/>
           <w:szCs w:val="18"/>
         </w:rPr>
-        <w:t>202</w:t>
-      </w:r>
-      <w:r>
-        <w:rPr>
-          <w:rFonts w:ascii="Verdana" w:hAnsi="Verdana" w:cs="Arial"/>
-          <w:sz w:val="18"/>
-          <w:szCs w:val="18"/>
-        </w:rPr>
-        <w:t>5</w:t>
+        <w:t>2026</w:t>
       </w:r>
     </w:p>
     <w:p>
@@ -1080,6 +1072,26 @@
     </w:p>
     <w:p>
       <w:pPr>
+        <w:spacing w:line="300" w:lineRule="atLeast"/>
+        <w:rPr>
+          <w:rFonts w:ascii="Verdana" w:eastAsia="Times New Roman" w:hAnsi="Verdana" w:cs="Segoe UI"/>
+          <w:sz w:val="18"/>
+          <w:szCs w:val="18"/>
+          <w:lang w:val="es-ES" w:eastAsia="zh-CN"/>
+        </w:rPr>
+      </w:pPr>
+      <w:r>
+        <w:rPr>
+          <w:rFonts w:ascii="Verdana" w:eastAsia="Times New Roman" w:hAnsi="Verdana" w:cs="Segoe UI"/>
+          <w:sz w:val="18"/>
+          <w:szCs w:val="18"/>
+          <w:lang w:val="es-ES" w:eastAsia="zh-CN"/>
+        </w:rPr>
+        <w:t>En caso de que alguna de las actividades programadas coincida con un día feriado, se le informarán oportunamente las modificaciones correspondientes al calendario.</w:t>
+      </w:r>
+    </w:p>
+    <w:p>
+      <w:pPr>
         <w:pStyle w:val="NormalWeb"/>
         <w:spacing w:before="0" w:beforeAutospacing="0" w:after="0" w:afterAutospacing="0"/>
         <w:jc w:val="both"/>
@@ -1087,6 +1099,7 @@
           <w:rFonts w:ascii="Verdana" w:hAnsi="Verdana" w:cs="Arial"/>
           <w:sz w:val="18"/>
           <w:szCs w:val="18"/>
+          <w:lang w:val="es-ES"/>
         </w:rPr>
       </w:pPr>
     </w:p>
@@ -1418,8 +1431,19 @@
                                 <w:szCs w:val="18"/>
                                 <w:lang w:val="pt-PT"/>
                               </w:rPr>
-                              <w:t>. Cuevas</w:t>
+                              <w:t xml:space="preserve">. </w:t>
                             </w:r>
+                            <w:proofErr w:type="spellStart"/>
+                            <w:r>
+                              <w:rPr>
+                                <w:rFonts w:ascii="Verdana" w:hAnsi="Verdana"/>
+                                <w:sz w:val="18"/>
+                                <w:szCs w:val="18"/>
+                                <w:lang w:val="pt-PT"/>
+                              </w:rPr>
+                              <w:t>Cuevas</w:t>
+                            </w:r>
+                            <w:proofErr w:type="spellEnd"/>
                           </w:p>
                           <w:p>
                             <w:pPr>
@@ -1438,8 +1462,19 @@
                                 <w:szCs w:val="18"/>
                                 <w:lang w:val="pt-PT"/>
                               </w:rPr>
-                              <w:t>Supply Chain LATAM Director</w:t>
+                              <w:t xml:space="preserve">Supply Chain LATAM </w:t>
                             </w:r>
+                            <w:proofErr w:type="spellStart"/>
+                            <w:r>
+                              <w:rPr>
+                                <w:rFonts w:ascii="Verdana" w:hAnsi="Verdana"/>
+                                <w:sz w:val="18"/>
+                                <w:szCs w:val="18"/>
+                                <w:lang w:val="pt-PT"/>
+                              </w:rPr>
+                              <w:t>Director</w:t>
+                            </w:r>
+                            <w:proofErr w:type="spellEnd"/>
                           </w:p>
                         </w:txbxContent>
                       </wps:txbx>
@@ -1463,11 +1498,7 @@
           </mc:Choice>
           <mc:Fallback>
             <w:pict>
-              <v:shapetype w14:anchorId="50CE7CB4" id="_x0000_t202" coordsize="21600,21600" o:spt="202" path="m,l,21600r21600,l21600,xe">
-                <v:stroke joinstyle="miter"/>
-                <v:path gradientshapeok="t" o:connecttype="rect"/>
-              </v:shapetype>
-              <v:shape id="_x0000_s1027" type="#_x0000_t202" style="position:absolute;margin-left:0;margin-top:91.6pt;width:193pt;height:37pt;z-index:251660289;visibility:visible;mso-wrap-style:square;mso-width-percent:0;mso-height-percent:0;mso-wrap-distance-left:9pt;mso-wrap-distance-top:0;mso-wrap-distance-right:9pt;mso-wrap-distance-bottom:0;mso-position-horizontal:center;mso-position-horizontal-relative:margin;mso-position-vertical:absolute;mso-position-vertical-relative:text;mso-width-percent:0;mso-height-percent:0;mso-width-relative:margin;mso-height-relative:margin;v-text-anchor:top" o:gfxdata="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" filled="f" stroked="f" strokeweight=".5pt">
+              <v:shape w14:anchorId="50CE7CB4" id="_x0000_s1027" type="#_x0000_t202" style="position:absolute;margin-left:0;margin-top:91.6pt;width:193pt;height:37pt;z-index:251660289;visibility:visible;mso-wrap-style:square;mso-width-percent:0;mso-height-percent:0;mso-wrap-distance-left:9pt;mso-wrap-distance-top:0;mso-wrap-distance-right:9pt;mso-wrap-distance-bottom:0;mso-position-horizontal:center;mso-position-horizontal-relative:margin;mso-position-vertical:absolute;mso-position-vertical-relative:text;mso-width-percent:0;mso-height-percent:0;mso-width-relative:margin;mso-height-relative:margin;v-text-anchor:top" o:gfxdata="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" filled="f" stroked="f" strokeweight=".5pt">
                 <v:textbox>
                   <w:txbxContent>
                     <w:p>
@@ -3093,7 +3124,7 @@
       <w:szCs w:val="20"/>
     </w:rPr>
   </w:style>
-  <w:style w:type="character" w:styleId="Textoennegrita">
+  <w:style w:type="character" w:styleId="Fuerte">
     <w:name w:val="Strong"/>
     <w:basedOn w:val="Fuentedeprrafopredeter"/>
     <w:uiPriority w:val="22"/>
@@ -3633,19 +3664,6 @@
 </file>
 
 <file path=customXml/item1.xml><?xml version="1.0" encoding="utf-8"?>
-<b:Sources xmlns:b="http://schemas.openxmlformats.org/officeDocument/2006/bibliography" xmlns="http://schemas.openxmlformats.org/officeDocument/2006/bibliography" SelectedStyle="/APA.XSL" StyleName="APA"/>
-</file>
-
-<file path=customXml/item2.xml><?xml version="1.0" encoding="utf-8"?>
-<?mso-contentType ?>
-<FormTemplates xmlns="http://schemas.microsoft.com/sharepoint/v3/contenttype/forms">
-  <Display>DocumentLibraryForm</Display>
-  <Edit>DocumentLibraryForm</Edit>
-  <New>DocumentLibraryForm</New>
-</FormTemplates>
-</file>
-
-<file path=customXml/item3.xml><?xml version="1.0" encoding="utf-8"?>
 <ct:contentTypeSchema xmlns:ct="http://schemas.microsoft.com/office/2006/metadata/contentType" xmlns:ma="http://schemas.microsoft.com/office/2006/metadata/properties/metaAttributes" ct:_="" ma:_="" ma:contentTypeName="Documento" ma:contentTypeID="0x0101002467C1B5FC2AE14D9751977B3BEFD2F4" ma:contentTypeVersion="4" ma:contentTypeDescription="Crear nuevo documento." ma:contentTypeScope="" ma:versionID="65f58c5ab10bd45654f4477bbd021a50">
   <xsd:schema xmlns:xsd="http://www.w3.org/2001/XMLSchema" xmlns:xs="http://www.w3.org/2001/XMLSchema" xmlns:p="http://schemas.microsoft.com/office/2006/metadata/properties" xmlns:ns2="fadd8f31-7d12-40bf-b302-26fb6f33724b" targetNamespace="http://schemas.microsoft.com/office/2006/metadata/properties" ma:root="true" ma:fieldsID="21f2e7d876b855be445fe4bacfd8e02f" ns2:_="">
     <xsd:import namespace="fadd8f31-7d12-40bf-b302-26fb6f33724b"/>
@@ -3789,6 +3807,19 @@
 </ct:contentTypeSchema>
 </file>
 
+<file path=customXml/item2.xml><?xml version="1.0" encoding="utf-8"?>
+<?mso-contentType ?>
+<FormTemplates xmlns="http://schemas.microsoft.com/sharepoint/v3/contenttype/forms">
+  <Display>DocumentLibraryForm</Display>
+  <Edit>DocumentLibraryForm</Edit>
+  <New>DocumentLibraryForm</New>
+</FormTemplates>
+</file>
+
+<file path=customXml/item3.xml><?xml version="1.0" encoding="utf-8"?>
+<b:Sources xmlns:b="http://schemas.openxmlformats.org/officeDocument/2006/bibliography" xmlns="http://schemas.openxmlformats.org/officeDocument/2006/bibliography" SelectedStyle="/APA.XSL" StyleName="APA"/>
+</file>
+
 <file path=customXml/item4.xml><?xml version="1.0" encoding="utf-8"?>
 <p:properties xmlns:p="http://schemas.microsoft.com/office/2006/metadata/properties" xmlns:xsi="http://www.w3.org/2001/XMLSchema-instance" xmlns:pc="http://schemas.microsoft.com/office/infopath/2007/PartnerControls">
   <documentManagement/>
@@ -3796,9 +3827,19 @@
 </file>
 
 <file path=customXml/itemProps1.xml><?xml version="1.0" encoding="utf-8"?>
-<ds:datastoreItem xmlns:ds="http://schemas.openxmlformats.org/officeDocument/2006/customXml" ds:itemID="{B3952E0D-F825-D04F-A8DC-7DA44B8DA180}">
+<ds:datastoreItem xmlns:ds="http://schemas.openxmlformats.org/officeDocument/2006/customXml" ds:itemID="{5458104C-4956-42E6-BCEF-802A2623FD78}">
   <ds:schemaRefs>
-    <ds:schemaRef ds:uri="http://schemas.openxmlformats.org/officeDocument/2006/bibliography"/>
+    <ds:schemaRef ds:uri="http://schemas.microsoft.com/office/2006/metadata/contentType"/>
+    <ds:schemaRef ds:uri="http://schemas.microsoft.com/office/2006/metadata/properties/metaAttributes"/>
+    <ds:schemaRef ds:uri="http://www.w3.org/2001/XMLSchema"/>
+    <ds:schemaRef ds:uri="http://schemas.microsoft.com/office/2006/metadata/properties"/>
+    <ds:schemaRef ds:uri="fadd8f31-7d12-40bf-b302-26fb6f33724b"/>
+    <ds:schemaRef ds:uri="http://schemas.microsoft.com/office/2006/documentManagement/types"/>
+    <ds:schemaRef ds:uri="http://schemas.microsoft.com/office/infopath/2007/PartnerControls"/>
+    <ds:schemaRef ds:uri="http://schemas.openxmlformats.org/package/2006/metadata/core-properties"/>
+    <ds:schemaRef ds:uri="http://purl.org/dc/elements/1.1/"/>
+    <ds:schemaRef ds:uri="http://purl.org/dc/terms/"/>
+    <ds:schemaRef ds:uri="http://schemas.microsoft.com/internal/obd"/>
   </ds:schemaRefs>
 </ds:datastoreItem>
 </file>
@@ -3812,19 +3853,9 @@
 </file>
 
 <file path=customXml/itemProps3.xml><?xml version="1.0" encoding="utf-8"?>
-<ds:datastoreItem xmlns:ds="http://schemas.openxmlformats.org/officeDocument/2006/customXml" ds:itemID="{5458104C-4956-42E6-BCEF-802A2623FD78}">
+<ds:datastoreItem xmlns:ds="http://schemas.openxmlformats.org/officeDocument/2006/customXml" ds:itemID="{B3952E0D-F825-D04F-A8DC-7DA44B8DA180}">
   <ds:schemaRefs>
-    <ds:schemaRef ds:uri="http://schemas.microsoft.com/office/2006/metadata/contentType"/>
-    <ds:schemaRef ds:uri="http://schemas.microsoft.com/office/2006/metadata/properties/metaAttributes"/>
-    <ds:schemaRef ds:uri="http://www.w3.org/2001/XMLSchema"/>
-    <ds:schemaRef ds:uri="http://schemas.microsoft.com/office/2006/metadata/properties"/>
-    <ds:schemaRef ds:uri="fadd8f31-7d12-40bf-b302-26fb6f33724b"/>
-    <ds:schemaRef ds:uri="http://schemas.microsoft.com/office/2006/documentManagement/types"/>
-    <ds:schemaRef ds:uri="http://schemas.microsoft.com/office/infopath/2007/PartnerControls"/>
-    <ds:schemaRef ds:uri="http://schemas.openxmlformats.org/package/2006/metadata/core-properties"/>
-    <ds:schemaRef ds:uri="http://purl.org/dc/elements/1.1/"/>
-    <ds:schemaRef ds:uri="http://purl.org/dc/terms/"/>
-    <ds:schemaRef ds:uri="http://schemas.microsoft.com/internal/obd"/>
+    <ds:schemaRef ds:uri="http://schemas.openxmlformats.org/officeDocument/2006/bibliography"/>
   </ds:schemaRefs>
 </ds:datastoreItem>
 </file>

</xml_diff>